<commit_message>
improvoved for better ui - consulting fee doc template conditions
</commit_message>
<xml_diff>
--- a/apps/api/proposal-template.docx
+++ b/apps/api/proposal-template.docx
@@ -38,12 +38,12 @@
             <wp:extent cx="7998928" cy="10058400"/>
             <wp:effectExtent b="0" l="0" r="0" t="0"/>
             <wp:wrapNone/>
-            <wp:docPr id="4" name="image3.png"/>
+            <wp:docPr id="4" name="image1.png"/>
             <a:graphic>
               <a:graphicData uri="http://schemas.openxmlformats.org/drawingml/2006/picture">
                 <pic:pic>
                   <pic:nvPicPr>
-                    <pic:cNvPr id="0" name="image3.png"/>
+                    <pic:cNvPr id="0" name="image1.png"/>
                     <pic:cNvPicPr preferRelativeResize="0"/>
                   </pic:nvPicPr>
                   <pic:blipFill>
@@ -2120,7 +2120,7 @@
     <w:tbl>
       <w:tblPr>
         <w:tblStyle w:val="Table1"/>
-        <w:tblW w:w="8640.0" w:type="dxa"/>
+        <w:tblW w:w="8610.0" w:type="dxa"/>
         <w:jc w:val="left"/>
         <w:tblInd w:w="-5.0" w:type="dxa"/>
         <w:tblBorders>
@@ -2136,11 +2136,11 @@
       </w:tblPr>
       <w:tblGrid>
         <w:gridCol w:w="7110"/>
-        <w:gridCol w:w="1530"/>
+        <w:gridCol w:w="1500"/>
         <w:tblGridChange w:id="0">
           <w:tblGrid>
             <w:gridCol w:w="7110"/>
-            <w:gridCol w:w="1530"/>
+            <w:gridCol w:w="1500"/>
           </w:tblGrid>
         </w:tblGridChange>
       </w:tblGrid>
@@ -2246,7 +2246,7 @@
                 <w:szCs w:val="20"/>
                 <w:rtl w:val="0"/>
               </w:rPr>
-              <w:t xml:space="preserve">{#hasFeeEstimate}CONSTRUCTION COST ESTIMATE {/hasFeeEstimate}</w:t>
+              <w:t xml:space="preserve">{#hasFeeEstimate}CONSTRUCTION COST ESTIMATE </w:t>
             </w:r>
           </w:p>
         </w:tc>
@@ -2303,12 +2303,8 @@
             </w:pPr>
             <w:r>
               <w:rPr>
-                <w:rFonts w:ascii="Avenir" w:cs="Avenir" w:eastAsia="Avenir" w:hAnsi="Avenir"/>
-                <w:sz w:val="20"/>
-                <w:szCs w:val="20"/>
-                <w:rtl w:val="0"/>
-              </w:rPr>
-              <w:t xml:space="preserve">{#hasFeeEstimate}</w:t>
+                <w:rtl w:val="0"/>
+              </w:rPr>
             </w:r>
           </w:p>
           <w:p>
@@ -2347,10 +2343,11 @@
             <w:pPr>
               <w:numPr>
                 <w:ilvl w:val="0"/>
-                <w:numId w:val="7"/>
+                <w:numId w:val="2"/>
               </w:numPr>
               <w:ind w:left="720" w:hanging="360"/>
               <w:rPr>
+                <w:rFonts w:ascii="Noto Sans Symbols" w:cs="Noto Sans Symbols" w:eastAsia="Noto Sans Symbols" w:hAnsi="Noto Sans Symbols"/>
                 <w:sz w:val="20"/>
                 <w:szCs w:val="20"/>
               </w:rPr>
@@ -2363,21 +2360,17 @@
                 <w:rtl w:val="0"/>
               </w:rPr>
               <w:t xml:space="preserve">Project Statistics </w:t>
-            </w:r>
-            <w:r>
-              <w:rPr>
-                <w:rtl w:val="0"/>
-              </w:rPr>
             </w:r>
           </w:p>
           <w:p>
             <w:pPr>
               <w:numPr>
                 <w:ilvl w:val="0"/>
-                <w:numId w:val="7"/>
+                <w:numId w:val="2"/>
               </w:numPr>
               <w:ind w:left="720" w:hanging="360"/>
               <w:rPr>
+                <w:rFonts w:ascii="Noto Sans Symbols" w:cs="Noto Sans Symbols" w:eastAsia="Noto Sans Symbols" w:hAnsi="Noto Sans Symbols"/>
                 <w:sz w:val="20"/>
                 <w:szCs w:val="20"/>
               </w:rPr>
@@ -2390,21 +2383,17 @@
                 <w:rtl w:val="0"/>
               </w:rPr>
               <w:t xml:space="preserve">Measure Available Drawings</w:t>
-            </w:r>
-            <w:r>
-              <w:rPr>
-                <w:rtl w:val="0"/>
-              </w:rPr>
             </w:r>
           </w:p>
           <w:p>
             <w:pPr>
               <w:numPr>
                 <w:ilvl w:val="0"/>
-                <w:numId w:val="7"/>
+                <w:numId w:val="2"/>
               </w:numPr>
               <w:ind w:left="720" w:hanging="360"/>
               <w:rPr>
+                <w:rFonts w:ascii="Noto Sans Symbols" w:cs="Noto Sans Symbols" w:eastAsia="Noto Sans Symbols" w:hAnsi="Noto Sans Symbols"/>
                 <w:sz w:val="20"/>
                 <w:szCs w:val="20"/>
               </w:rPr>
@@ -2417,21 +2406,17 @@
                 <w:rtl w:val="0"/>
               </w:rPr>
               <w:t xml:space="preserve">16 Divisional (Trade format) Construction Cost Estimate</w:t>
-            </w:r>
-            <w:r>
-              <w:rPr>
-                <w:rtl w:val="0"/>
-              </w:rPr>
             </w:r>
           </w:p>
           <w:p>
             <w:pPr>
               <w:numPr>
                 <w:ilvl w:val="0"/>
-                <w:numId w:val="7"/>
+                <w:numId w:val="2"/>
               </w:numPr>
               <w:ind w:left="720" w:hanging="360"/>
               <w:rPr>
+                <w:rFonts w:ascii="Noto Sans Symbols" w:cs="Noto Sans Symbols" w:eastAsia="Noto Sans Symbols" w:hAnsi="Noto Sans Symbols"/>
                 <w:sz w:val="20"/>
                 <w:szCs w:val="20"/>
               </w:rPr>
@@ -2444,25 +2429,6 @@
                 <w:rtl w:val="0"/>
               </w:rPr>
               <w:t xml:space="preserve">Executive Summary</w:t>
-            </w:r>
-          </w:p>
-          <w:p>
-            <w:pPr>
-              <w:ind w:left="0" w:firstLine="0"/>
-              <w:rPr>
-                <w:rFonts w:ascii="Avenir" w:cs="Avenir" w:eastAsia="Avenir" w:hAnsi="Avenir"/>
-                <w:sz w:val="20"/>
-                <w:szCs w:val="20"/>
-              </w:rPr>
-            </w:pPr>
-            <w:r>
-              <w:rPr>
-                <w:rFonts w:ascii="Avenir" w:cs="Avenir" w:eastAsia="Avenir" w:hAnsi="Avenir"/>
-                <w:sz w:val="20"/>
-                <w:szCs w:val="20"/>
-                <w:rtl w:val="0"/>
-              </w:rPr>
-              <w:t xml:space="preserve">{/hasFeeEstimate}</w:t>
             </w:r>
           </w:p>
           <w:p>
@@ -2532,30 +2498,27 @@
             </w:pPr>
             <w:r>
               <w:rPr>
-                <w:rFonts w:ascii="Avenir" w:cs="Avenir" w:eastAsia="Avenir" w:hAnsi="Avenir"/>
-                <w:sz w:val="20"/>
-                <w:szCs w:val="20"/>
-                <w:rtl w:val="0"/>
-              </w:rPr>
-              <w:t xml:space="preserve">{</w:t>
-            </w:r>
-            <w:r>
-              <w:rPr>
-                <w:rFonts w:ascii="Avenir" w:cs="Avenir" w:eastAsia="Avenir" w:hAnsi="Avenir"/>
-                <w:sz w:val="20"/>
-                <w:szCs w:val="20"/>
-                <w:rtl w:val="0"/>
-              </w:rPr>
-              <w:t xml:space="preserve">feeEstimateTotal</w:t>
-            </w:r>
-            <w:r>
-              <w:rPr>
-                <w:rFonts w:ascii="Avenir" w:cs="Avenir" w:eastAsia="Avenir" w:hAnsi="Avenir"/>
-                <w:sz w:val="20"/>
-                <w:szCs w:val="20"/>
-                <w:rtl w:val="0"/>
-              </w:rPr>
-              <w:t xml:space="preserve">}</w:t>
+                <w:rtl w:val="0"/>
+              </w:rPr>
+            </w:r>
+          </w:p>
+          <w:p>
+            <w:pPr>
+              <w:jc w:val="center"/>
+              <w:rPr>
+                <w:rFonts w:ascii="Avenir" w:cs="Avenir" w:eastAsia="Avenir" w:hAnsi="Avenir"/>
+                <w:sz w:val="20"/>
+                <w:szCs w:val="20"/>
+              </w:rPr>
+            </w:pPr>
+            <w:r>
+              <w:rPr>
+                <w:rFonts w:ascii="Avenir" w:cs="Avenir" w:eastAsia="Avenir" w:hAnsi="Avenir"/>
+                <w:sz w:val="20"/>
+                <w:szCs w:val="20"/>
+                <w:rtl w:val="0"/>
+              </w:rPr>
+              <w:t xml:space="preserve">{feeEstimateTotal}</w:t>
             </w:r>
           </w:p>
         </w:tc>
@@ -2624,16 +2587,13 @@
             <w:r>
               <w:rPr>
                 <w:rFonts w:ascii="Avenir" w:cs="Avenir" w:eastAsia="Avenir" w:hAnsi="Avenir"/>
-                <w:sz w:val="20"/>
-                <w:szCs w:val="20"/>
-                <w:rtl w:val="0"/>
-              </w:rPr>
-              <w:t xml:space="preserve">{feeEstimateTotal}</w:t>
-            </w:r>
-            <w:r>
-              <w:rPr>
-                <w:rtl w:val="0"/>
-              </w:rPr>
+                <w:b w:val="1"/>
+                <w:bCs w:val="1"/>
+                <w:sz w:val="20"/>
+                <w:szCs w:val="20"/>
+                <w:rtl w:val="0"/>
+              </w:rPr>
+              <w:t xml:space="preserve">{feeEstimateTotal}{/hasFeeEstimate}</w:t>
             </w:r>
           </w:p>
         </w:tc>
@@ -2673,7 +2633,7 @@
                 <w:szCs w:val="20"/>
                 <w:rtl w:val="0"/>
               </w:rPr>
-              <w:t xml:space="preserve">{#hasFeeProforma}PROJECT PROFORMA {/hasFeeProforma}</w:t>
+              <w:t xml:space="preserve">{#hasFeeProforma}PROJECT PROFORMA </w:t>
             </w:r>
           </w:p>
         </w:tc>
@@ -2733,358 +2693,162 @@
             </w:pPr>
             <w:r>
               <w:rPr>
+                <w:rtl w:val="0"/>
+              </w:rPr>
+            </w:r>
+          </w:p>
+          <w:p>
+            <w:pPr>
+              <w:jc w:val="both"/>
+              <w:rPr>
+                <w:rFonts w:ascii="Avenir" w:cs="Avenir" w:eastAsia="Avenir" w:hAnsi="Avenir"/>
+                <w:sz w:val="20"/>
+                <w:szCs w:val="20"/>
+              </w:rPr>
+            </w:pPr>
+            <w:r>
+              <w:rPr>
+                <w:rFonts w:ascii="Avenir" w:cs="Avenir" w:eastAsia="Avenir" w:hAnsi="Avenir"/>
+                <w:sz w:val="20"/>
+                <w:szCs w:val="20"/>
+                <w:rtl w:val="0"/>
+              </w:rPr>
+              <w:t xml:space="preserve">Project Pro Forma Report Including: </w:t>
+            </w:r>
+          </w:p>
+          <w:p>
+            <w:pPr>
+              <w:jc w:val="both"/>
+              <w:rPr>
                 <w:rFonts w:ascii="Avenir" w:cs="Avenir" w:eastAsia="Avenir" w:hAnsi="Avenir"/>
                 <w:sz w:val="18"/>
                 <w:szCs w:val="18"/>
-                <w:rtl w:val="0"/>
-              </w:rPr>
-              <w:t xml:space="preserve">{#hasFeeProforma}</w:t>
-            </w:r>
-          </w:p>
-          <w:p>
-            <w:pPr>
-              <w:jc w:val="both"/>
-              <w:rPr>
-                <w:rFonts w:ascii="Avenir" w:cs="Avenir" w:eastAsia="Avenir" w:hAnsi="Avenir"/>
-                <w:sz w:val="20"/>
-                <w:szCs w:val="20"/>
-              </w:rPr>
-            </w:pPr>
-            <w:r>
-              <w:rPr>
-                <w:rFonts w:ascii="Avenir" w:cs="Avenir" w:eastAsia="Avenir" w:hAnsi="Avenir"/>
-                <w:sz w:val="20"/>
-                <w:szCs w:val="20"/>
-                <w:rtl w:val="0"/>
-              </w:rPr>
-              <w:t xml:space="preserve">Project Pro Forma Report Including: </w:t>
-            </w:r>
-          </w:p>
-          <w:p>
-            <w:pPr>
-              <w:jc w:val="both"/>
-              <w:rPr>
-                <w:rFonts w:ascii="Avenir" w:cs="Avenir" w:eastAsia="Avenir" w:hAnsi="Avenir"/>
-                <w:sz w:val="18"/>
-                <w:szCs w:val="18"/>
-              </w:rPr>
-            </w:pPr>
-            <w:r>
-              <w:rPr>
-                <w:rtl w:val="0"/>
-              </w:rPr>
-            </w:r>
-          </w:p>
-          <w:p>
-            <w:pPr>
-              <w:keepNext w:val="0"/>
-              <w:keepLines w:val="0"/>
-              <w:widowControl w:val="1"/>
+              </w:rPr>
+            </w:pPr>
+            <w:r>
+              <w:rPr>
+                <w:rtl w:val="0"/>
+              </w:rPr>
+            </w:r>
+          </w:p>
+          <w:p>
+            <w:pPr>
               <w:numPr>
                 <w:ilvl w:val="0"/>
-                <w:numId w:val="8"/>
+                <w:numId w:val="13"/>
               </w:numPr>
-              <w:pBdr>
-                <w:top w:space="0" w:sz="0" w:val="nil"/>
-                <w:left w:space="0" w:sz="0" w:val="nil"/>
-                <w:bottom w:space="0" w:sz="0" w:val="nil"/>
-                <w:right w:space="0" w:sz="0" w:val="nil"/>
-                <w:between w:space="0" w:sz="0" w:val="nil"/>
-              </w:pBdr>
-              <w:shd w:fill="auto" w:val="clear"/>
-              <w:spacing w:after="0" w:before="0" w:line="240" w:lineRule="auto"/>
-              <w:ind w:left="720" w:right="0" w:hanging="360"/>
+              <w:ind w:left="720" w:hanging="360"/>
               <w:jc w:val="both"/>
               <w:rPr>
-                <w:b w:val="0"/>
-                <w:bCs w:val="0"/>
-                <w:i w:val="0"/>
-                <w:iCs w:val="0"/>
-                <w:smallCaps w:val="0"/>
-                <w:strike w:val="0"/>
-                <w:color w:val="000000"/>
-                <w:sz w:val="20"/>
-                <w:szCs w:val="20"/>
-                <w:vertAlign w:val="baseline"/>
-              </w:rPr>
-            </w:pPr>
-            <w:r>
-              <w:rPr>
-                <w:rFonts w:ascii="Avenir" w:cs="Avenir" w:eastAsia="Avenir" w:hAnsi="Avenir"/>
-                <w:b w:val="0"/>
-                <w:bCs w:val="0"/>
-                <w:i w:val="0"/>
-                <w:iCs w:val="0"/>
-                <w:smallCaps w:val="0"/>
-                <w:strike w:val="0"/>
-                <w:color w:val="000000"/>
-                <w:sz w:val="20"/>
-                <w:szCs w:val="20"/>
-                <w:u w:val="none"/>
-                <w:vertAlign w:val="baseline"/>
+                <w:rFonts w:ascii="Noto Sans Symbols" w:cs="Noto Sans Symbols" w:eastAsia="Noto Sans Symbols" w:hAnsi="Noto Sans Symbols"/>
+                <w:sz w:val="20"/>
+                <w:szCs w:val="20"/>
+              </w:rPr>
+            </w:pPr>
+            <w:r>
+              <w:rPr>
+                <w:rFonts w:ascii="Avenir" w:cs="Avenir" w:eastAsia="Avenir" w:hAnsi="Avenir"/>
+                <w:sz w:val="20"/>
+                <w:szCs w:val="20"/>
                 <w:rtl w:val="0"/>
               </w:rPr>
               <w:t xml:space="preserve">Proposed Project Budget (including all soft costs)</w:t>
             </w:r>
-            <w:r>
-              <w:rPr>
-                <w:rtl w:val="0"/>
-              </w:rPr>
-            </w:r>
-          </w:p>
-          <w:p>
-            <w:pPr>
-              <w:keepNext w:val="0"/>
-              <w:keepLines w:val="0"/>
-              <w:widowControl w:val="1"/>
+          </w:p>
+          <w:p>
+            <w:pPr>
               <w:numPr>
                 <w:ilvl w:val="0"/>
-                <w:numId w:val="8"/>
+                <w:numId w:val="13"/>
               </w:numPr>
-              <w:pBdr>
-                <w:top w:space="0" w:sz="0" w:val="nil"/>
-                <w:left w:space="0" w:sz="0" w:val="nil"/>
-                <w:bottom w:space="0" w:sz="0" w:val="nil"/>
-                <w:right w:space="0" w:sz="0" w:val="nil"/>
-                <w:between w:space="0" w:sz="0" w:val="nil"/>
-              </w:pBdr>
-              <w:shd w:fill="auto" w:val="clear"/>
-              <w:spacing w:after="0" w:before="0" w:line="240" w:lineRule="auto"/>
-              <w:ind w:left="720" w:right="0" w:hanging="360"/>
+              <w:ind w:left="720" w:hanging="360"/>
               <w:jc w:val="both"/>
               <w:rPr>
-                <w:b w:val="0"/>
-                <w:bCs w:val="0"/>
-                <w:i w:val="0"/>
-                <w:iCs w:val="0"/>
-                <w:smallCaps w:val="0"/>
-                <w:strike w:val="0"/>
-                <w:color w:val="000000"/>
-                <w:sz w:val="20"/>
-                <w:szCs w:val="20"/>
-                <w:vertAlign w:val="baseline"/>
-              </w:rPr>
-            </w:pPr>
-            <w:r>
-              <w:rPr>
-                <w:rFonts w:ascii="Avenir" w:cs="Avenir" w:eastAsia="Avenir" w:hAnsi="Avenir"/>
-                <w:b w:val="0"/>
-                <w:bCs w:val="0"/>
-                <w:i w:val="0"/>
-                <w:iCs w:val="0"/>
-                <w:smallCaps w:val="0"/>
-                <w:strike w:val="0"/>
-                <w:color w:val="000000"/>
-                <w:sz w:val="20"/>
-                <w:szCs w:val="20"/>
-                <w:u w:val="none"/>
-                <w:vertAlign w:val="baseline"/>
+                <w:rFonts w:ascii="Noto Sans Symbols" w:cs="Noto Sans Symbols" w:eastAsia="Noto Sans Symbols" w:hAnsi="Noto Sans Symbols"/>
+                <w:sz w:val="20"/>
+                <w:szCs w:val="20"/>
+              </w:rPr>
+            </w:pPr>
+            <w:r>
+              <w:rPr>
+                <w:rFonts w:ascii="Avenir" w:cs="Avenir" w:eastAsia="Avenir" w:hAnsi="Avenir"/>
+                <w:sz w:val="20"/>
+                <w:szCs w:val="20"/>
                 <w:rtl w:val="0"/>
               </w:rPr>
               <w:t xml:space="preserve">Construction Budget (as above)</w:t>
             </w:r>
-            <w:r>
-              <w:rPr>
-                <w:rtl w:val="0"/>
-              </w:rPr>
-            </w:r>
-          </w:p>
-          <w:p>
-            <w:pPr>
-              <w:keepNext w:val="0"/>
-              <w:keepLines w:val="0"/>
-              <w:widowControl w:val="1"/>
+          </w:p>
+          <w:p>
+            <w:pPr>
               <w:numPr>
                 <w:ilvl w:val="0"/>
-                <w:numId w:val="8"/>
+                <w:numId w:val="13"/>
               </w:numPr>
-              <w:pBdr>
-                <w:top w:space="0" w:sz="0" w:val="nil"/>
-                <w:left w:space="0" w:sz="0" w:val="nil"/>
-                <w:bottom w:space="0" w:sz="0" w:val="nil"/>
-                <w:right w:space="0" w:sz="0" w:val="nil"/>
-                <w:between w:space="0" w:sz="0" w:val="nil"/>
-              </w:pBdr>
-              <w:shd w:fill="auto" w:val="clear"/>
-              <w:spacing w:after="0" w:before="0" w:line="240" w:lineRule="auto"/>
-              <w:ind w:left="720" w:right="0" w:hanging="360"/>
+              <w:ind w:left="720" w:hanging="360"/>
               <w:jc w:val="both"/>
               <w:rPr>
-                <w:b w:val="0"/>
-                <w:bCs w:val="0"/>
-                <w:i w:val="0"/>
-                <w:iCs w:val="0"/>
-                <w:smallCaps w:val="0"/>
-                <w:strike w:val="0"/>
-                <w:color w:val="000000"/>
-                <w:sz w:val="20"/>
-                <w:szCs w:val="20"/>
-                <w:vertAlign w:val="baseline"/>
-              </w:rPr>
-            </w:pPr>
-            <w:r>
-              <w:rPr>
-                <w:rFonts w:ascii="Avenir" w:cs="Avenir" w:eastAsia="Avenir" w:hAnsi="Avenir"/>
-                <w:b w:val="0"/>
-                <w:bCs w:val="0"/>
-                <w:i w:val="0"/>
-                <w:iCs w:val="0"/>
-                <w:smallCaps w:val="0"/>
-                <w:strike w:val="0"/>
-                <w:color w:val="000000"/>
-                <w:sz w:val="20"/>
-                <w:szCs w:val="20"/>
-                <w:u w:val="none"/>
-                <w:vertAlign w:val="baseline"/>
+                <w:rFonts w:ascii="Noto Sans Symbols" w:cs="Noto Sans Symbols" w:eastAsia="Noto Sans Symbols" w:hAnsi="Noto Sans Symbols"/>
+                <w:sz w:val="20"/>
+                <w:szCs w:val="20"/>
+              </w:rPr>
+            </w:pPr>
+            <w:r>
+              <w:rPr>
+                <w:rFonts w:ascii="Avenir" w:cs="Avenir" w:eastAsia="Avenir" w:hAnsi="Avenir"/>
+                <w:sz w:val="20"/>
+                <w:szCs w:val="20"/>
                 <w:rtl w:val="0"/>
               </w:rPr>
               <w:t xml:space="preserve">Proposed Source of Funds</w:t>
             </w:r>
-            <w:r>
-              <w:rPr>
-                <w:rtl w:val="0"/>
-              </w:rPr>
-            </w:r>
-          </w:p>
-          <w:p>
-            <w:pPr>
-              <w:keepNext w:val="0"/>
-              <w:keepLines w:val="0"/>
-              <w:widowControl w:val="1"/>
+          </w:p>
+          <w:p>
+            <w:pPr>
               <w:numPr>
                 <w:ilvl w:val="0"/>
-                <w:numId w:val="8"/>
+                <w:numId w:val="13"/>
               </w:numPr>
-              <w:pBdr>
-                <w:top w:space="0" w:sz="0" w:val="nil"/>
-                <w:left w:space="0" w:sz="0" w:val="nil"/>
-                <w:bottom w:space="0" w:sz="0" w:val="nil"/>
-                <w:right w:space="0" w:sz="0" w:val="nil"/>
-                <w:between w:space="0" w:sz="0" w:val="nil"/>
-              </w:pBdr>
-              <w:shd w:fill="auto" w:val="clear"/>
-              <w:spacing w:after="0" w:before="0" w:line="240" w:lineRule="auto"/>
-              <w:ind w:left="720" w:right="0" w:hanging="360"/>
+              <w:ind w:left="720" w:hanging="360"/>
               <w:jc w:val="both"/>
               <w:rPr>
-                <w:b w:val="0"/>
-                <w:bCs w:val="0"/>
-                <w:i w:val="0"/>
-                <w:iCs w:val="0"/>
-                <w:smallCaps w:val="0"/>
-                <w:strike w:val="0"/>
-                <w:color w:val="000000"/>
-                <w:sz w:val="20"/>
-                <w:szCs w:val="20"/>
-                <w:vertAlign w:val="baseline"/>
-              </w:rPr>
-            </w:pPr>
-            <w:r>
-              <w:rPr>
-                <w:rFonts w:ascii="Avenir" w:cs="Avenir" w:eastAsia="Avenir" w:hAnsi="Avenir"/>
-                <w:b w:val="0"/>
-                <w:bCs w:val="0"/>
-                <w:i w:val="0"/>
-                <w:iCs w:val="0"/>
-                <w:smallCaps w:val="0"/>
-                <w:strike w:val="0"/>
-                <w:color w:val="000000"/>
-                <w:sz w:val="20"/>
-                <w:szCs w:val="20"/>
-                <w:u w:val="none"/>
-                <w:vertAlign w:val="baseline"/>
+                <w:rFonts w:ascii="Noto Sans Symbols" w:cs="Noto Sans Symbols" w:eastAsia="Noto Sans Symbols" w:hAnsi="Noto Sans Symbols"/>
+                <w:sz w:val="20"/>
+                <w:szCs w:val="20"/>
+              </w:rPr>
+            </w:pPr>
+            <w:r>
+              <w:rPr>
+                <w:rFonts w:ascii="Avenir" w:cs="Avenir" w:eastAsia="Avenir" w:hAnsi="Avenir"/>
+                <w:sz w:val="20"/>
+                <w:szCs w:val="20"/>
                 <w:rtl w:val="0"/>
               </w:rPr>
               <w:t xml:space="preserve">Total Projected Revenue Summary (In consultation with Owner)</w:t>
             </w:r>
-            <w:r>
-              <w:rPr>
-                <w:rtl w:val="0"/>
-              </w:rPr>
-            </w:r>
-          </w:p>
-          <w:p>
-            <w:pPr>
-              <w:keepNext w:val="0"/>
-              <w:keepLines w:val="0"/>
-              <w:widowControl w:val="1"/>
+          </w:p>
+          <w:p>
+            <w:pPr>
               <w:numPr>
                 <w:ilvl w:val="0"/>
-                <w:numId w:val="8"/>
+                <w:numId w:val="13"/>
               </w:numPr>
-              <w:pBdr>
-                <w:top w:space="0" w:sz="0" w:val="nil"/>
-                <w:left w:space="0" w:sz="0" w:val="nil"/>
-                <w:bottom w:space="0" w:sz="0" w:val="nil"/>
-                <w:right w:space="0" w:sz="0" w:val="nil"/>
-                <w:between w:space="0" w:sz="0" w:val="nil"/>
-              </w:pBdr>
-              <w:shd w:fill="auto" w:val="clear"/>
-              <w:spacing w:after="0" w:before="0" w:line="240" w:lineRule="auto"/>
-              <w:ind w:left="720" w:right="0" w:hanging="360"/>
+              <w:ind w:left="720" w:hanging="360"/>
               <w:jc w:val="both"/>
               <w:rPr>
-                <w:b w:val="0"/>
-                <w:bCs w:val="0"/>
-                <w:i w:val="0"/>
-                <w:iCs w:val="0"/>
-                <w:smallCaps w:val="0"/>
-                <w:strike w:val="0"/>
-                <w:color w:val="000000"/>
-                <w:sz w:val="20"/>
-                <w:szCs w:val="20"/>
-                <w:vertAlign w:val="baseline"/>
-              </w:rPr>
-            </w:pPr>
-            <w:r>
-              <w:rPr>
-                <w:rFonts w:ascii="Avenir" w:cs="Avenir" w:eastAsia="Avenir" w:hAnsi="Avenir"/>
-                <w:b w:val="0"/>
-                <w:bCs w:val="0"/>
-                <w:i w:val="0"/>
-                <w:iCs w:val="0"/>
-                <w:smallCaps w:val="0"/>
-                <w:strike w:val="0"/>
-                <w:color w:val="000000"/>
-                <w:sz w:val="20"/>
-                <w:szCs w:val="20"/>
-                <w:u w:val="none"/>
-                <w:vertAlign w:val="baseline"/>
+                <w:rFonts w:ascii="Noto Sans Symbols" w:cs="Noto Sans Symbols" w:eastAsia="Noto Sans Symbols" w:hAnsi="Noto Sans Symbols"/>
+                <w:sz w:val="20"/>
+                <w:szCs w:val="20"/>
+              </w:rPr>
+            </w:pPr>
+            <w:r>
+              <w:rPr>
+                <w:rFonts w:ascii="Avenir" w:cs="Avenir" w:eastAsia="Avenir" w:hAnsi="Avenir"/>
+                <w:sz w:val="20"/>
+                <w:szCs w:val="20"/>
                 <w:rtl w:val="0"/>
               </w:rPr>
               <w:t xml:space="preserve">Executive Summary </w:t>
-            </w:r>
-          </w:p>
-          <w:p>
-            <w:pPr>
-              <w:keepNext w:val="0"/>
-              <w:keepLines w:val="0"/>
-              <w:widowControl w:val="1"/>
-              <w:pBdr>
-                <w:top w:space="0" w:sz="0" w:val="nil"/>
-                <w:left w:space="0" w:sz="0" w:val="nil"/>
-                <w:bottom w:space="0" w:sz="0" w:val="nil"/>
-                <w:right w:space="0" w:sz="0" w:val="nil"/>
-                <w:between w:space="0" w:sz="0" w:val="nil"/>
-              </w:pBdr>
-              <w:shd w:fill="auto" w:val="clear"/>
-              <w:spacing w:after="0" w:before="0" w:line="240" w:lineRule="auto"/>
-              <w:ind w:left="0" w:right="0" w:firstLine="0"/>
-              <w:jc w:val="both"/>
-              <w:rPr>
-                <w:rFonts w:ascii="Avenir" w:cs="Avenir" w:eastAsia="Avenir" w:hAnsi="Avenir"/>
-                <w:sz w:val="20"/>
-                <w:szCs w:val="20"/>
-              </w:rPr>
-            </w:pPr>
-            <w:r>
-              <w:rPr>
-                <w:rFonts w:ascii="Avenir" w:cs="Avenir" w:eastAsia="Avenir" w:hAnsi="Avenir"/>
-                <w:sz w:val="20"/>
-                <w:szCs w:val="20"/>
-                <w:rtl w:val="0"/>
-              </w:rPr>
-              <w:t xml:space="preserve">{/hasFeeProforma}</w:t>
             </w:r>
           </w:p>
           <w:p>
@@ -3223,7 +2987,7 @@
                 <w:szCs w:val="20"/>
                 <w:rtl w:val="0"/>
               </w:rPr>
-              <w:t xml:space="preserve">SUB TOTAL </w:t>
+              <w:t xml:space="preserve">SUBTOTAL</w:t>
             </w:r>
           </w:p>
         </w:tc>
@@ -3257,7 +3021,7 @@
                 <w:szCs w:val="20"/>
                 <w:rtl w:val="0"/>
               </w:rPr>
-              <w:t xml:space="preserve">{feeProformaTotal}</w:t>
+              <w:t xml:space="preserve">{feeProformaTotal}{/hasFeeProforma}</w:t>
             </w:r>
           </w:p>
         </w:tc>
@@ -3342,6 +3106,9 @@
       <w:pPr>
         <w:rPr>
           <w:rFonts w:ascii="Avenir" w:cs="Avenir" w:eastAsia="Avenir" w:hAnsi="Avenir"/>
+          <w:b w:val="1"/>
+          <w:bCs w:val="1"/>
+          <w:u w:val="single"/>
         </w:rPr>
       </w:pPr>
       <w:r>
@@ -3868,7 +3635,7 @@
       <w:pPr>
         <w:numPr>
           <w:ilvl w:val="0"/>
-          <w:numId w:val="2"/>
+          <w:numId w:val="3"/>
         </w:numPr>
         <w:ind w:left="720" w:hanging="360"/>
         <w:rPr>
@@ -5139,7 +4906,7 @@
               <w:widowControl w:val="1"/>
               <w:numPr>
                 <w:ilvl w:val="0"/>
-                <w:numId w:val="6"/>
+                <w:numId w:val="7"/>
               </w:numPr>
               <w:pBdr>
                 <w:top w:space="0" w:sz="0" w:val="nil"/>
@@ -8789,7 +8556,7 @@
         <w:widowControl w:val="0"/>
         <w:numPr>
           <w:ilvl w:val="0"/>
-          <w:numId w:val="3"/>
+          <w:numId w:val="4"/>
         </w:numPr>
         <w:pBdr>
           <w:top w:space="0" w:sz="0" w:val="nil"/>
@@ -9223,7 +8990,7 @@
         <w:widowControl w:val="1"/>
         <w:numPr>
           <w:ilvl w:val="0"/>
-          <w:numId w:val="3"/>
+          <w:numId w:val="4"/>
         </w:numPr>
         <w:pBdr>
           <w:top w:space="0" w:sz="0" w:val="nil"/>
@@ -11950,7 +11717,7 @@
         <w:widowControl w:val="1"/>
         <w:numPr>
           <w:ilvl w:val="0"/>
-          <w:numId w:val="5"/>
+          <w:numId w:val="6"/>
         </w:numPr>
         <w:pBdr>
           <w:top w:space="0" w:sz="0" w:val="nil"/>
@@ -12008,7 +11775,7 @@
         <w:widowControl w:val="1"/>
         <w:numPr>
           <w:ilvl w:val="0"/>
-          <w:numId w:val="5"/>
+          <w:numId w:val="6"/>
         </w:numPr>
         <w:pBdr>
           <w:top w:space="0" w:sz="0" w:val="nil"/>
@@ -13314,7 +13081,7 @@
         <w:widowControl w:val="1"/>
         <w:numPr>
           <w:ilvl w:val="0"/>
-          <w:numId w:val="4"/>
+          <w:numId w:val="5"/>
         </w:numPr>
         <w:pBdr>
           <w:top w:space="0" w:sz="0" w:val="nil"/>
@@ -13358,176 +13125,6 @@
         </w:rPr>
         <w:t xml:space="preserve">Offer a bespoke Terms of Reference which can be as in depth as required by the Lender on a project by project basis</w:t>
       </w:r>
-      <w:r>
-        <w:rPr>
-          <w:rtl w:val="0"/>
-        </w:rPr>
-      </w:r>
-    </w:p>
-    <w:p>
-      <w:pPr>
-        <w:keepNext w:val="0"/>
-        <w:keepLines w:val="0"/>
-        <w:pageBreakBefore w:val="0"/>
-        <w:widowControl w:val="1"/>
-        <w:numPr>
-          <w:ilvl w:val="0"/>
-          <w:numId w:val="4"/>
-        </w:numPr>
-        <w:pBdr>
-          <w:top w:space="0" w:sz="0" w:val="nil"/>
-          <w:left w:space="0" w:sz="0" w:val="nil"/>
-          <w:bottom w:space="0" w:sz="0" w:val="nil"/>
-          <w:right w:space="0" w:sz="0" w:val="nil"/>
-          <w:between w:space="0" w:sz="0" w:val="nil"/>
-        </w:pBdr>
-        <w:shd w:fill="auto" w:val="clear"/>
-        <w:spacing w:after="0" w:before="0" w:line="240" w:lineRule="auto"/>
-        <w:ind w:left="720" w:right="0" w:hanging="360"/>
-        <w:jc w:val="both"/>
-        <w:rPr>
-          <w:b w:val="0"/>
-          <w:bCs w:val="0"/>
-          <w:i w:val="0"/>
-          <w:iCs w:val="0"/>
-          <w:smallCaps w:val="0"/>
-          <w:strike w:val="0"/>
-          <w:color w:val="000000"/>
-          <w:sz w:val="20"/>
-          <w:szCs w:val="20"/>
-          <w:vertAlign w:val="baseline"/>
-        </w:rPr>
-      </w:pPr>
-      <w:r>
-        <w:rPr>
-          <w:rFonts w:ascii="Avenir" w:cs="Avenir" w:eastAsia="Avenir" w:hAnsi="Avenir"/>
-          <w:b w:val="0"/>
-          <w:bCs w:val="0"/>
-          <w:i w:val="0"/>
-          <w:iCs w:val="0"/>
-          <w:smallCaps w:val="0"/>
-          <w:strike w:val="0"/>
-          <w:color w:val="000000"/>
-          <w:sz w:val="20"/>
-          <w:szCs w:val="20"/>
-          <w:u w:val="none"/>
-          <w:vertAlign w:val="baseline"/>
-          <w:rtl w:val="0"/>
-        </w:rPr>
-        <w:t xml:space="preserve">Prior to commencement and finalization of the Credit Facility or Discussion Paper, we discuss the final agreed Terms of Reference with the account manager</w:t>
-      </w:r>
-      <w:r>
-        <w:rPr>
-          <w:rtl w:val="0"/>
-        </w:rPr>
-      </w:r>
-    </w:p>
-    <w:p>
-      <w:pPr>
-        <w:keepNext w:val="0"/>
-        <w:keepLines w:val="0"/>
-        <w:pageBreakBefore w:val="0"/>
-        <w:widowControl w:val="1"/>
-        <w:numPr>
-          <w:ilvl w:val="0"/>
-          <w:numId w:val="4"/>
-        </w:numPr>
-        <w:pBdr>
-          <w:top w:space="0" w:sz="0" w:val="nil"/>
-          <w:left w:space="0" w:sz="0" w:val="nil"/>
-          <w:bottom w:space="0" w:sz="0" w:val="nil"/>
-          <w:right w:space="0" w:sz="0" w:val="nil"/>
-          <w:between w:space="0" w:sz="0" w:val="nil"/>
-        </w:pBdr>
-        <w:shd w:fill="auto" w:val="clear"/>
-        <w:spacing w:after="0" w:before="0" w:line="240" w:lineRule="auto"/>
-        <w:ind w:left="720" w:right="0" w:hanging="360"/>
-        <w:jc w:val="both"/>
-        <w:rPr>
-          <w:b w:val="0"/>
-          <w:bCs w:val="0"/>
-          <w:i w:val="0"/>
-          <w:iCs w:val="0"/>
-          <w:smallCaps w:val="0"/>
-          <w:strike w:val="0"/>
-          <w:color w:val="000000"/>
-          <w:sz w:val="20"/>
-          <w:szCs w:val="20"/>
-          <w:vertAlign w:val="baseline"/>
-        </w:rPr>
-      </w:pPr>
-      <w:r>
-        <w:rPr>
-          <w:rFonts w:ascii="Avenir" w:cs="Avenir" w:eastAsia="Avenir" w:hAnsi="Avenir"/>
-          <w:b w:val="0"/>
-          <w:bCs w:val="0"/>
-          <w:i w:val="0"/>
-          <w:iCs w:val="0"/>
-          <w:smallCaps w:val="0"/>
-          <w:strike w:val="0"/>
-          <w:color w:val="000000"/>
-          <w:sz w:val="20"/>
-          <w:szCs w:val="20"/>
-          <w:u w:val="none"/>
-          <w:vertAlign w:val="baseline"/>
-          <w:rtl w:val="0"/>
-        </w:rPr>
-        <w:t xml:space="preserve">Prior to issuance of the Preliminary Bank report, we meet or arrange a conference call with the Lender to review the report in its entirety and focus on any potential areas of concern.</w:t>
-      </w:r>
-      <w:r>
-        <w:rPr>
-          <w:rtl w:val="0"/>
-        </w:rPr>
-      </w:r>
-    </w:p>
-    <w:p>
-      <w:pPr>
-        <w:jc w:val="both"/>
-        <w:rPr>
-          <w:rFonts w:ascii="Avenir" w:cs="Avenir" w:eastAsia="Avenir" w:hAnsi="Avenir"/>
-          <w:sz w:val="20"/>
-          <w:szCs w:val="20"/>
-        </w:rPr>
-      </w:pPr>
-      <w:r>
-        <w:rPr>
-          <w:rtl w:val="0"/>
-        </w:rPr>
-      </w:r>
-    </w:p>
-    <w:p>
-      <w:pPr>
-        <w:jc w:val="both"/>
-        <w:rPr>
-          <w:rFonts w:ascii="Avenir" w:cs="Avenir" w:eastAsia="Avenir" w:hAnsi="Avenir"/>
-          <w:color w:val="a2772c"/>
-          <w:sz w:val="20"/>
-          <w:szCs w:val="20"/>
-          <w:u w:val="single"/>
-        </w:rPr>
-      </w:pPr>
-      <w:r>
-        <w:rPr>
-          <w:rFonts w:ascii="Avenir" w:cs="Avenir" w:eastAsia="Avenir" w:hAnsi="Avenir"/>
-          <w:color w:val="a2772c"/>
-          <w:sz w:val="20"/>
-          <w:szCs w:val="20"/>
-          <w:u w:val="single"/>
-          <w:rtl w:val="0"/>
-        </w:rPr>
-        <w:t xml:space="preserve">Ongoing Reporting</w:t>
-      </w:r>
-    </w:p>
-    <w:p>
-      <w:pPr>
-        <w:rPr>
-          <w:rFonts w:ascii="Avenir" w:cs="Avenir" w:eastAsia="Avenir" w:hAnsi="Avenir"/>
-          <w:color w:val="a2772c"/>
-          <w:sz w:val="20"/>
-          <w:szCs w:val="20"/>
-          <w:u w:val="single"/>
-        </w:rPr>
-      </w:pPr>
       <w:r>
         <w:rPr>
           <w:rtl w:val="0"/>
@@ -13584,7 +13181,7 @@
           <w:vertAlign w:val="baseline"/>
           <w:rtl w:val="0"/>
         </w:rPr>
-        <w:t xml:space="preserve">Telephone calls with Developer/Lender as required to identify any areas of concern</w:t>
+        <w:t xml:space="preserve">Prior to commencement and finalization of the Credit Facility or Discussion Paper, we discuss the final agreed Terms of Reference with the account manager</w:t>
       </w:r>
       <w:r>
         <w:rPr>
@@ -13642,8 +13239,62 @@
           <w:vertAlign w:val="baseline"/>
           <w:rtl w:val="0"/>
         </w:rPr>
-        <w:t xml:space="preserve">Arrange site visits with Developer/Lender </w:t>
-      </w:r>
+        <w:t xml:space="preserve">Prior to issuance of the Preliminary Bank report, we meet or arrange a conference call with the Lender to review the report in its entirety and focus on any potential areas of concern.</w:t>
+      </w:r>
+      <w:r>
+        <w:rPr>
+          <w:rtl w:val="0"/>
+        </w:rPr>
+      </w:r>
+    </w:p>
+    <w:p>
+      <w:pPr>
+        <w:jc w:val="both"/>
+        <w:rPr>
+          <w:rFonts w:ascii="Avenir" w:cs="Avenir" w:eastAsia="Avenir" w:hAnsi="Avenir"/>
+          <w:sz w:val="20"/>
+          <w:szCs w:val="20"/>
+        </w:rPr>
+      </w:pPr>
+      <w:r>
+        <w:rPr>
+          <w:rtl w:val="0"/>
+        </w:rPr>
+      </w:r>
+    </w:p>
+    <w:p>
+      <w:pPr>
+        <w:jc w:val="both"/>
+        <w:rPr>
+          <w:rFonts w:ascii="Avenir" w:cs="Avenir" w:eastAsia="Avenir" w:hAnsi="Avenir"/>
+          <w:color w:val="a2772c"/>
+          <w:sz w:val="20"/>
+          <w:szCs w:val="20"/>
+          <w:u w:val="single"/>
+        </w:rPr>
+      </w:pPr>
+      <w:r>
+        <w:rPr>
+          <w:rFonts w:ascii="Avenir" w:cs="Avenir" w:eastAsia="Avenir" w:hAnsi="Avenir"/>
+          <w:color w:val="a2772c"/>
+          <w:sz w:val="20"/>
+          <w:szCs w:val="20"/>
+          <w:u w:val="single"/>
+          <w:rtl w:val="0"/>
+        </w:rPr>
+        <w:t xml:space="preserve">Ongoing Reporting</w:t>
+      </w:r>
+    </w:p>
+    <w:p>
+      <w:pPr>
+        <w:rPr>
+          <w:rFonts w:ascii="Avenir" w:cs="Avenir" w:eastAsia="Avenir" w:hAnsi="Avenir"/>
+          <w:color w:val="a2772c"/>
+          <w:sz w:val="20"/>
+          <w:szCs w:val="20"/>
+          <w:u w:val="single"/>
+        </w:rPr>
+      </w:pPr>
       <w:r>
         <w:rPr>
           <w:rtl w:val="0"/>
@@ -13658,7 +13309,7 @@
         <w:widowControl w:val="1"/>
         <w:numPr>
           <w:ilvl w:val="0"/>
-          <w:numId w:val="5"/>
+          <w:numId w:val="6"/>
         </w:numPr>
         <w:pBdr>
           <w:top w:space="0" w:sz="0" w:val="nil"/>
@@ -13700,7 +13351,7 @@
           <w:vertAlign w:val="baseline"/>
           <w:rtl w:val="0"/>
         </w:rPr>
-        <w:t xml:space="preserve">Preparation of quarterly dashboards or executive summaries for all projects detailing the pertinent project information and any material changes from the previous quarter </w:t>
+        <w:t xml:space="preserve">Telephone calls with Developer/Lender as required to identify any areas of concern</w:t>
       </w:r>
       <w:r>
         <w:rPr>
@@ -13716,7 +13367,123 @@
         <w:widowControl w:val="1"/>
         <w:numPr>
           <w:ilvl w:val="0"/>
-          <w:numId w:val="5"/>
+          <w:numId w:val="6"/>
+        </w:numPr>
+        <w:pBdr>
+          <w:top w:space="0" w:sz="0" w:val="nil"/>
+          <w:left w:space="0" w:sz="0" w:val="nil"/>
+          <w:bottom w:space="0" w:sz="0" w:val="nil"/>
+          <w:right w:space="0" w:sz="0" w:val="nil"/>
+          <w:between w:space="0" w:sz="0" w:val="nil"/>
+        </w:pBdr>
+        <w:shd w:fill="auto" w:val="clear"/>
+        <w:spacing w:after="0" w:before="0" w:line="240" w:lineRule="auto"/>
+        <w:ind w:left="720" w:right="0" w:hanging="360"/>
+        <w:jc w:val="both"/>
+        <w:rPr>
+          <w:b w:val="0"/>
+          <w:bCs w:val="0"/>
+          <w:i w:val="0"/>
+          <w:iCs w:val="0"/>
+          <w:smallCaps w:val="0"/>
+          <w:strike w:val="0"/>
+          <w:color w:val="000000"/>
+          <w:sz w:val="20"/>
+          <w:szCs w:val="20"/>
+          <w:vertAlign w:val="baseline"/>
+        </w:rPr>
+      </w:pPr>
+      <w:r>
+        <w:rPr>
+          <w:rFonts w:ascii="Avenir" w:cs="Avenir" w:eastAsia="Avenir" w:hAnsi="Avenir"/>
+          <w:b w:val="0"/>
+          <w:bCs w:val="0"/>
+          <w:i w:val="0"/>
+          <w:iCs w:val="0"/>
+          <w:smallCaps w:val="0"/>
+          <w:strike w:val="0"/>
+          <w:color w:val="000000"/>
+          <w:sz w:val="20"/>
+          <w:szCs w:val="20"/>
+          <w:u w:val="none"/>
+          <w:vertAlign w:val="baseline"/>
+          <w:rtl w:val="0"/>
+        </w:rPr>
+        <w:t xml:space="preserve">Arrange site visits with Developer/Lender </w:t>
+      </w:r>
+      <w:r>
+        <w:rPr>
+          <w:rtl w:val="0"/>
+        </w:rPr>
+      </w:r>
+    </w:p>
+    <w:p>
+      <w:pPr>
+        <w:keepNext w:val="0"/>
+        <w:keepLines w:val="0"/>
+        <w:pageBreakBefore w:val="0"/>
+        <w:widowControl w:val="1"/>
+        <w:numPr>
+          <w:ilvl w:val="0"/>
+          <w:numId w:val="6"/>
+        </w:numPr>
+        <w:pBdr>
+          <w:top w:space="0" w:sz="0" w:val="nil"/>
+          <w:left w:space="0" w:sz="0" w:val="nil"/>
+          <w:bottom w:space="0" w:sz="0" w:val="nil"/>
+          <w:right w:space="0" w:sz="0" w:val="nil"/>
+          <w:between w:space="0" w:sz="0" w:val="nil"/>
+        </w:pBdr>
+        <w:shd w:fill="auto" w:val="clear"/>
+        <w:spacing w:after="0" w:before="0" w:line="240" w:lineRule="auto"/>
+        <w:ind w:left="720" w:right="0" w:hanging="360"/>
+        <w:jc w:val="both"/>
+        <w:rPr>
+          <w:b w:val="0"/>
+          <w:bCs w:val="0"/>
+          <w:i w:val="0"/>
+          <w:iCs w:val="0"/>
+          <w:smallCaps w:val="0"/>
+          <w:strike w:val="0"/>
+          <w:color w:val="000000"/>
+          <w:sz w:val="20"/>
+          <w:szCs w:val="20"/>
+          <w:vertAlign w:val="baseline"/>
+        </w:rPr>
+      </w:pPr>
+      <w:r>
+        <w:rPr>
+          <w:rFonts w:ascii="Avenir" w:cs="Avenir" w:eastAsia="Avenir" w:hAnsi="Avenir"/>
+          <w:b w:val="0"/>
+          <w:bCs w:val="0"/>
+          <w:i w:val="0"/>
+          <w:iCs w:val="0"/>
+          <w:smallCaps w:val="0"/>
+          <w:strike w:val="0"/>
+          <w:color w:val="000000"/>
+          <w:sz w:val="20"/>
+          <w:szCs w:val="20"/>
+          <w:u w:val="none"/>
+          <w:vertAlign w:val="baseline"/>
+          <w:rtl w:val="0"/>
+        </w:rPr>
+        <w:t xml:space="preserve">Preparation of quarterly dashboards or executive summaries for all projects detailing the pertinent project information and any material changes from the previous quarter </w:t>
+      </w:r>
+      <w:r>
+        <w:rPr>
+          <w:rtl w:val="0"/>
+        </w:rPr>
+      </w:r>
+    </w:p>
+    <w:p>
+      <w:pPr>
+        <w:keepNext w:val="0"/>
+        <w:keepLines w:val="0"/>
+        <w:pageBreakBefore w:val="0"/>
+        <w:widowControl w:val="1"/>
+        <w:numPr>
+          <w:ilvl w:val="0"/>
+          <w:numId w:val="6"/>
         </w:numPr>
         <w:pBdr>
           <w:top w:space="0" w:sz="0" w:val="nil"/>
@@ -13851,7 +13618,7 @@
               <w:widowControl w:val="1"/>
               <w:numPr>
                 <w:ilvl w:val="0"/>
-                <w:numId w:val="6"/>
+                <w:numId w:val="7"/>
               </w:numPr>
               <w:pBdr>
                 <w:top w:space="0" w:sz="0" w:val="nil"/>
@@ -22139,7 +21906,7 @@
               <w:widowControl w:val="1"/>
               <w:numPr>
                 <w:ilvl w:val="0"/>
-                <w:numId w:val="6"/>
+                <w:numId w:val="7"/>
               </w:numPr>
               <w:pBdr>
                 <w:top w:space="0" w:sz="0" w:val="nil"/>
@@ -34063,7 +33830,7 @@
               <w:widowControl w:val="1"/>
               <w:numPr>
                 <w:ilvl w:val="0"/>
-                <w:numId w:val="6"/>
+                <w:numId w:val="7"/>
               </w:numPr>
               <w:pBdr>
                 <w:top w:space="0" w:sz="0" w:val="nil"/>
@@ -35268,12 +35035,12 @@
         <wp:inline distB="0" distT="0" distL="0" distR="0">
           <wp:extent cx="2788475" cy="814265"/>
           <wp:effectExtent b="0" l="0" r="0" t="0"/>
-          <wp:docPr descr="FMILogo_LoRes_RGB.jpg" id="6" name="image1.jpg"/>
+          <wp:docPr descr="FMILogo_LoRes_RGB.jpg" id="6" name="image3.jpg"/>
           <a:graphic>
             <a:graphicData uri="http://schemas.openxmlformats.org/drawingml/2006/picture">
               <pic:pic>
                 <pic:nvPicPr>
-                  <pic:cNvPr descr="FMILogo_LoRes_RGB.jpg" id="0" name="image1.jpg"/>
+                  <pic:cNvPr descr="FMILogo_LoRes_RGB.jpg" id="0" name="image3.jpg"/>
                   <pic:cNvPicPr preferRelativeResize="0"/>
                 </pic:nvPicPr>
                 <pic:blipFill>
@@ -35509,7 +35276,7 @@
     <w:lvl w:ilvl="1">
       <w:start w:val="1"/>
       <w:numFmt w:val="bullet"/>
-      <w:lvlText w:val="○"/>
+      <w:lvlText w:val="o"/>
       <w:lvlJc w:val="left"/>
       <w:pPr>
         <w:ind w:left="1440" w:hanging="360"/>
@@ -35521,7 +35288,7 @@
     <w:lvl w:ilvl="2">
       <w:start w:val="1"/>
       <w:numFmt w:val="bullet"/>
-      <w:lvlText w:val="■"/>
+      <w:lvlText w:val="▪"/>
       <w:lvlJc w:val="left"/>
       <w:pPr>
         <w:ind w:left="2160" w:hanging="360"/>
@@ -35545,7 +35312,7 @@
     <w:lvl w:ilvl="4">
       <w:start w:val="1"/>
       <w:numFmt w:val="bullet"/>
-      <w:lvlText w:val="○"/>
+      <w:lvlText w:val="o"/>
       <w:lvlJc w:val="left"/>
       <w:pPr>
         <w:ind w:left="3600" w:hanging="360"/>
@@ -35557,7 +35324,7 @@
     <w:lvl w:ilvl="5">
       <w:start w:val="1"/>
       <w:numFmt w:val="bullet"/>
-      <w:lvlText w:val="■"/>
+      <w:lvlText w:val="▪"/>
       <w:lvlJc w:val="left"/>
       <w:pPr>
         <w:ind w:left="4320" w:hanging="360"/>
@@ -35581,7 +35348,7 @@
     <w:lvl w:ilvl="7">
       <w:start w:val="1"/>
       <w:numFmt w:val="bullet"/>
-      <w:lvlText w:val="○"/>
+      <w:lvlText w:val="o"/>
       <w:lvlJc w:val="left"/>
       <w:pPr>
         <w:ind w:left="5760" w:hanging="360"/>
@@ -35593,7 +35360,7 @@
     <w:lvl w:ilvl="8">
       <w:start w:val="1"/>
       <w:numFmt w:val="bullet"/>
-      <w:lvlText w:val="■"/>
+      <w:lvlText w:val="▪"/>
       <w:lvlJc w:val="left"/>
       <w:pPr>
         <w:ind w:left="6480" w:hanging="360"/>
@@ -35613,31 +35380,31 @@
         <w:ind w:left="720" w:hanging="360"/>
       </w:pPr>
       <w:rPr>
-        <w:rFonts w:ascii="Noto Sans Symbols" w:cs="Noto Sans Symbols" w:eastAsia="Noto Sans Symbols" w:hAnsi="Noto Sans Symbols"/>
+        <w:u w:val="none"/>
       </w:rPr>
     </w:lvl>
     <w:lvl w:ilvl="1">
       <w:start w:val="1"/>
       <w:numFmt w:val="bullet"/>
-      <w:lvlText w:val="o"/>
+      <w:lvlText w:val="○"/>
       <w:lvlJc w:val="left"/>
       <w:pPr>
         <w:ind w:left="1440" w:hanging="360"/>
       </w:pPr>
       <w:rPr>
-        <w:rFonts w:ascii="Courier New" w:cs="Courier New" w:eastAsia="Courier New" w:hAnsi="Courier New"/>
+        <w:u w:val="none"/>
       </w:rPr>
     </w:lvl>
     <w:lvl w:ilvl="2">
       <w:start w:val="1"/>
       <w:numFmt w:val="bullet"/>
-      <w:lvlText w:val="▪"/>
+      <w:lvlText w:val="■"/>
       <w:lvlJc w:val="left"/>
       <w:pPr>
         <w:ind w:left="2160" w:hanging="360"/>
       </w:pPr>
       <w:rPr>
-        <w:rFonts w:ascii="Noto Sans Symbols" w:cs="Noto Sans Symbols" w:eastAsia="Noto Sans Symbols" w:hAnsi="Noto Sans Symbols"/>
+        <w:u w:val="none"/>
       </w:rPr>
     </w:lvl>
     <w:lvl w:ilvl="3">
@@ -35649,31 +35416,31 @@
         <w:ind w:left="2880" w:hanging="360"/>
       </w:pPr>
       <w:rPr>
-        <w:rFonts w:ascii="Noto Sans Symbols" w:cs="Noto Sans Symbols" w:eastAsia="Noto Sans Symbols" w:hAnsi="Noto Sans Symbols"/>
+        <w:u w:val="none"/>
       </w:rPr>
     </w:lvl>
     <w:lvl w:ilvl="4">
       <w:start w:val="1"/>
       <w:numFmt w:val="bullet"/>
-      <w:lvlText w:val="o"/>
+      <w:lvlText w:val="○"/>
       <w:lvlJc w:val="left"/>
       <w:pPr>
         <w:ind w:left="3600" w:hanging="360"/>
       </w:pPr>
       <w:rPr>
-        <w:rFonts w:ascii="Courier New" w:cs="Courier New" w:eastAsia="Courier New" w:hAnsi="Courier New"/>
+        <w:u w:val="none"/>
       </w:rPr>
     </w:lvl>
     <w:lvl w:ilvl="5">
       <w:start w:val="1"/>
       <w:numFmt w:val="bullet"/>
-      <w:lvlText w:val="▪"/>
+      <w:lvlText w:val="■"/>
       <w:lvlJc w:val="left"/>
       <w:pPr>
         <w:ind w:left="4320" w:hanging="360"/>
       </w:pPr>
       <w:rPr>
-        <w:rFonts w:ascii="Noto Sans Symbols" w:cs="Noto Sans Symbols" w:eastAsia="Noto Sans Symbols" w:hAnsi="Noto Sans Symbols"/>
+        <w:u w:val="none"/>
       </w:rPr>
     </w:lvl>
     <w:lvl w:ilvl="6">
@@ -35685,31 +35452,31 @@
         <w:ind w:left="5040" w:hanging="360"/>
       </w:pPr>
       <w:rPr>
-        <w:rFonts w:ascii="Noto Sans Symbols" w:cs="Noto Sans Symbols" w:eastAsia="Noto Sans Symbols" w:hAnsi="Noto Sans Symbols"/>
+        <w:u w:val="none"/>
       </w:rPr>
     </w:lvl>
     <w:lvl w:ilvl="7">
       <w:start w:val="1"/>
       <w:numFmt w:val="bullet"/>
-      <w:lvlText w:val="o"/>
+      <w:lvlText w:val="○"/>
       <w:lvlJc w:val="left"/>
       <w:pPr>
         <w:ind w:left="5760" w:hanging="360"/>
       </w:pPr>
       <w:rPr>
-        <w:rFonts w:ascii="Courier New" w:cs="Courier New" w:eastAsia="Courier New" w:hAnsi="Courier New"/>
+        <w:u w:val="none"/>
       </w:rPr>
     </w:lvl>
     <w:lvl w:ilvl="8">
       <w:start w:val="1"/>
       <w:numFmt w:val="bullet"/>
-      <w:lvlText w:val="▪"/>
+      <w:lvlText w:val="■"/>
       <w:lvlJc w:val="left"/>
       <w:pPr>
         <w:ind w:left="6480" w:hanging="360"/>
       </w:pPr>
       <w:rPr>
-        <w:rFonts w:ascii="Noto Sans Symbols" w:cs="Noto Sans Symbols" w:eastAsia="Noto Sans Symbols" w:hAnsi="Noto Sans Symbols"/>
+        <w:u w:val="none"/>
       </w:rPr>
     </w:lvl>
   </w:abstractNum>
@@ -35934,6 +35701,116 @@
     </w:lvl>
   </w:abstractNum>
   <w:abstractNum w:abstractNumId="6">
+    <w:lvl w:ilvl="0">
+      <w:start w:val="1"/>
+      <w:numFmt w:val="bullet"/>
+      <w:lvlText w:val="●"/>
+      <w:lvlJc w:val="left"/>
+      <w:pPr>
+        <w:ind w:left="720" w:hanging="360"/>
+      </w:pPr>
+      <w:rPr>
+        <w:rFonts w:ascii="Noto Sans Symbols" w:cs="Noto Sans Symbols" w:eastAsia="Noto Sans Symbols" w:hAnsi="Noto Sans Symbols"/>
+      </w:rPr>
+    </w:lvl>
+    <w:lvl w:ilvl="1">
+      <w:start w:val="1"/>
+      <w:numFmt w:val="bullet"/>
+      <w:lvlText w:val="o"/>
+      <w:lvlJc w:val="left"/>
+      <w:pPr>
+        <w:ind w:left="1440" w:hanging="360"/>
+      </w:pPr>
+      <w:rPr>
+        <w:rFonts w:ascii="Courier New" w:cs="Courier New" w:eastAsia="Courier New" w:hAnsi="Courier New"/>
+      </w:rPr>
+    </w:lvl>
+    <w:lvl w:ilvl="2">
+      <w:start w:val="1"/>
+      <w:numFmt w:val="bullet"/>
+      <w:lvlText w:val="▪"/>
+      <w:lvlJc w:val="left"/>
+      <w:pPr>
+        <w:ind w:left="2160" w:hanging="360"/>
+      </w:pPr>
+      <w:rPr>
+        <w:rFonts w:ascii="Noto Sans Symbols" w:cs="Noto Sans Symbols" w:eastAsia="Noto Sans Symbols" w:hAnsi="Noto Sans Symbols"/>
+      </w:rPr>
+    </w:lvl>
+    <w:lvl w:ilvl="3">
+      <w:start w:val="1"/>
+      <w:numFmt w:val="bullet"/>
+      <w:lvlText w:val="●"/>
+      <w:lvlJc w:val="left"/>
+      <w:pPr>
+        <w:ind w:left="2880" w:hanging="360"/>
+      </w:pPr>
+      <w:rPr>
+        <w:rFonts w:ascii="Noto Sans Symbols" w:cs="Noto Sans Symbols" w:eastAsia="Noto Sans Symbols" w:hAnsi="Noto Sans Symbols"/>
+      </w:rPr>
+    </w:lvl>
+    <w:lvl w:ilvl="4">
+      <w:start w:val="1"/>
+      <w:numFmt w:val="bullet"/>
+      <w:lvlText w:val="o"/>
+      <w:lvlJc w:val="left"/>
+      <w:pPr>
+        <w:ind w:left="3600" w:hanging="360"/>
+      </w:pPr>
+      <w:rPr>
+        <w:rFonts w:ascii="Courier New" w:cs="Courier New" w:eastAsia="Courier New" w:hAnsi="Courier New"/>
+      </w:rPr>
+    </w:lvl>
+    <w:lvl w:ilvl="5">
+      <w:start w:val="1"/>
+      <w:numFmt w:val="bullet"/>
+      <w:lvlText w:val="▪"/>
+      <w:lvlJc w:val="left"/>
+      <w:pPr>
+        <w:ind w:left="4320" w:hanging="360"/>
+      </w:pPr>
+      <w:rPr>
+        <w:rFonts w:ascii="Noto Sans Symbols" w:cs="Noto Sans Symbols" w:eastAsia="Noto Sans Symbols" w:hAnsi="Noto Sans Symbols"/>
+      </w:rPr>
+    </w:lvl>
+    <w:lvl w:ilvl="6">
+      <w:start w:val="1"/>
+      <w:numFmt w:val="bullet"/>
+      <w:lvlText w:val="●"/>
+      <w:lvlJc w:val="left"/>
+      <w:pPr>
+        <w:ind w:left="5040" w:hanging="360"/>
+      </w:pPr>
+      <w:rPr>
+        <w:rFonts w:ascii="Noto Sans Symbols" w:cs="Noto Sans Symbols" w:eastAsia="Noto Sans Symbols" w:hAnsi="Noto Sans Symbols"/>
+      </w:rPr>
+    </w:lvl>
+    <w:lvl w:ilvl="7">
+      <w:start w:val="1"/>
+      <w:numFmt w:val="bullet"/>
+      <w:lvlText w:val="o"/>
+      <w:lvlJc w:val="left"/>
+      <w:pPr>
+        <w:ind w:left="5760" w:hanging="360"/>
+      </w:pPr>
+      <w:rPr>
+        <w:rFonts w:ascii="Courier New" w:cs="Courier New" w:eastAsia="Courier New" w:hAnsi="Courier New"/>
+      </w:rPr>
+    </w:lvl>
+    <w:lvl w:ilvl="8">
+      <w:start w:val="1"/>
+      <w:numFmt w:val="bullet"/>
+      <w:lvlText w:val="▪"/>
+      <w:lvlJc w:val="left"/>
+      <w:pPr>
+        <w:ind w:left="6480" w:hanging="360"/>
+      </w:pPr>
+      <w:rPr>
+        <w:rFonts w:ascii="Noto Sans Symbols" w:cs="Noto Sans Symbols" w:eastAsia="Noto Sans Symbols" w:hAnsi="Noto Sans Symbols"/>
+      </w:rPr>
+    </w:lvl>
+  </w:abstractNum>
+  <w:abstractNum w:abstractNumId="7">
     <w:lvl w:ilvl="0">
       <w:start w:val="1"/>
       <w:numFmt w:val="upperLetter"/>
@@ -36081,116 +35958,6 @@
         <w:ind w:left="4320" w:hanging="1440"/>
       </w:pPr>
       <w:rPr/>
-    </w:lvl>
-  </w:abstractNum>
-  <w:abstractNum w:abstractNumId="7">
-    <w:lvl w:ilvl="0">
-      <w:start w:val="1"/>
-      <w:numFmt w:val="bullet"/>
-      <w:lvlText w:val="●"/>
-      <w:lvlJc w:val="left"/>
-      <w:pPr>
-        <w:ind w:left="720" w:hanging="360"/>
-      </w:pPr>
-      <w:rPr>
-        <w:rFonts w:ascii="Noto Sans Symbols" w:cs="Noto Sans Symbols" w:eastAsia="Noto Sans Symbols" w:hAnsi="Noto Sans Symbols"/>
-      </w:rPr>
-    </w:lvl>
-    <w:lvl w:ilvl="1">
-      <w:start w:val="1"/>
-      <w:numFmt w:val="bullet"/>
-      <w:lvlText w:val="o"/>
-      <w:lvlJc w:val="left"/>
-      <w:pPr>
-        <w:ind w:left="1440" w:hanging="360"/>
-      </w:pPr>
-      <w:rPr>
-        <w:rFonts w:ascii="Courier New" w:cs="Courier New" w:eastAsia="Courier New" w:hAnsi="Courier New"/>
-      </w:rPr>
-    </w:lvl>
-    <w:lvl w:ilvl="2">
-      <w:start w:val="1"/>
-      <w:numFmt w:val="bullet"/>
-      <w:lvlText w:val="▪"/>
-      <w:lvlJc w:val="left"/>
-      <w:pPr>
-        <w:ind w:left="2160" w:hanging="360"/>
-      </w:pPr>
-      <w:rPr>
-        <w:rFonts w:ascii="Noto Sans Symbols" w:cs="Noto Sans Symbols" w:eastAsia="Noto Sans Symbols" w:hAnsi="Noto Sans Symbols"/>
-      </w:rPr>
-    </w:lvl>
-    <w:lvl w:ilvl="3">
-      <w:start w:val="1"/>
-      <w:numFmt w:val="bullet"/>
-      <w:lvlText w:val="●"/>
-      <w:lvlJc w:val="left"/>
-      <w:pPr>
-        <w:ind w:left="2880" w:hanging="360"/>
-      </w:pPr>
-      <w:rPr>
-        <w:rFonts w:ascii="Noto Sans Symbols" w:cs="Noto Sans Symbols" w:eastAsia="Noto Sans Symbols" w:hAnsi="Noto Sans Symbols"/>
-      </w:rPr>
-    </w:lvl>
-    <w:lvl w:ilvl="4">
-      <w:start w:val="1"/>
-      <w:numFmt w:val="bullet"/>
-      <w:lvlText w:val="o"/>
-      <w:lvlJc w:val="left"/>
-      <w:pPr>
-        <w:ind w:left="3600" w:hanging="360"/>
-      </w:pPr>
-      <w:rPr>
-        <w:rFonts w:ascii="Courier New" w:cs="Courier New" w:eastAsia="Courier New" w:hAnsi="Courier New"/>
-      </w:rPr>
-    </w:lvl>
-    <w:lvl w:ilvl="5">
-      <w:start w:val="1"/>
-      <w:numFmt w:val="bullet"/>
-      <w:lvlText w:val="▪"/>
-      <w:lvlJc w:val="left"/>
-      <w:pPr>
-        <w:ind w:left="4320" w:hanging="360"/>
-      </w:pPr>
-      <w:rPr>
-        <w:rFonts w:ascii="Noto Sans Symbols" w:cs="Noto Sans Symbols" w:eastAsia="Noto Sans Symbols" w:hAnsi="Noto Sans Symbols"/>
-      </w:rPr>
-    </w:lvl>
-    <w:lvl w:ilvl="6">
-      <w:start w:val="1"/>
-      <w:numFmt w:val="bullet"/>
-      <w:lvlText w:val="●"/>
-      <w:lvlJc w:val="left"/>
-      <w:pPr>
-        <w:ind w:left="5040" w:hanging="360"/>
-      </w:pPr>
-      <w:rPr>
-        <w:rFonts w:ascii="Noto Sans Symbols" w:cs="Noto Sans Symbols" w:eastAsia="Noto Sans Symbols" w:hAnsi="Noto Sans Symbols"/>
-      </w:rPr>
-    </w:lvl>
-    <w:lvl w:ilvl="7">
-      <w:start w:val="1"/>
-      <w:numFmt w:val="bullet"/>
-      <w:lvlText w:val="o"/>
-      <w:lvlJc w:val="left"/>
-      <w:pPr>
-        <w:ind w:left="5760" w:hanging="360"/>
-      </w:pPr>
-      <w:rPr>
-        <w:rFonts w:ascii="Courier New" w:cs="Courier New" w:eastAsia="Courier New" w:hAnsi="Courier New"/>
-      </w:rPr>
-    </w:lvl>
-    <w:lvl w:ilvl="8">
-      <w:start w:val="1"/>
-      <w:numFmt w:val="bullet"/>
-      <w:lvlText w:val="▪"/>
-      <w:lvlJc w:val="left"/>
-      <w:pPr>
-        <w:ind w:left="6480" w:hanging="360"/>
-      </w:pPr>
-      <w:rPr>
-        <w:rFonts w:ascii="Noto Sans Symbols" w:cs="Noto Sans Symbols" w:eastAsia="Noto Sans Symbols" w:hAnsi="Noto Sans Symbols"/>
-      </w:rPr>
     </w:lvl>
   </w:abstractNum>
   <w:abstractNum w:abstractNumId="8">

</xml_diff>